<commit_message>
fix report for 6th sprint
</commit_message>
<xml_diff>
--- a/docs/report/6 спринт 16-04-25.docx
+++ b/docs/report/6 спринт 16-04-25.docx
@@ -133,6 +133,24 @@
           <w:sz w:val="28"/>
           <w:szCs w:val="28"/>
         </w:rPr>
+        <w:t>12</w:t>
+      </w:r>
+      <w:r>
+        <w:rPr>
+          <w:rStyle w:val="translatable-message"/>
+          <w:rFonts w:ascii="Times New Roman" w:hAnsi="Times New Roman" w:cs="Times New Roman"/>
+          <w:sz w:val="28"/>
+          <w:szCs w:val="28"/>
+        </w:rPr>
+        <w:t>.</w:t>
+      </w:r>
+      <w:r>
+        <w:rPr>
+          <w:rStyle w:val="translatable-message"/>
+          <w:rFonts w:ascii="Times New Roman" w:hAnsi="Times New Roman" w:cs="Times New Roman"/>
+          <w:sz w:val="28"/>
+          <w:szCs w:val="28"/>
+        </w:rPr>
         <w:t>0</w:t>
       </w:r>
       <w:r>
@@ -142,6 +160,24 @@
           <w:sz w:val="28"/>
           <w:szCs w:val="28"/>
         </w:rPr>
+        <w:t>4</w:t>
+      </w:r>
+      <w:r>
+        <w:rPr>
+          <w:rStyle w:val="translatable-message"/>
+          <w:rFonts w:ascii="Times New Roman" w:hAnsi="Times New Roman" w:cs="Times New Roman"/>
+          <w:sz w:val="28"/>
+          <w:szCs w:val="28"/>
+        </w:rPr>
+        <w:t>.202</w:t>
+      </w:r>
+      <w:r>
+        <w:rPr>
+          <w:rStyle w:val="translatable-message"/>
+          <w:rFonts w:ascii="Times New Roman" w:hAnsi="Times New Roman" w:cs="Times New Roman"/>
+          <w:sz w:val="28"/>
+          <w:szCs w:val="28"/>
+        </w:rPr>
         <w:t>5</w:t>
       </w:r>
       <w:r>
@@ -151,51 +187,6 @@
           <w:sz w:val="28"/>
           <w:szCs w:val="28"/>
         </w:rPr>
-        <w:t>.</w:t>
-      </w:r>
-      <w:r>
-        <w:rPr>
-          <w:rStyle w:val="translatable-message"/>
-          <w:rFonts w:ascii="Times New Roman" w:hAnsi="Times New Roman" w:cs="Times New Roman"/>
-          <w:sz w:val="28"/>
-          <w:szCs w:val="28"/>
-        </w:rPr>
-        <w:t>0</w:t>
-      </w:r>
-      <w:r>
-        <w:rPr>
-          <w:rStyle w:val="translatable-message"/>
-          <w:rFonts w:ascii="Times New Roman" w:hAnsi="Times New Roman" w:cs="Times New Roman"/>
-          <w:sz w:val="28"/>
-          <w:szCs w:val="28"/>
-        </w:rPr>
-        <w:t>4</w:t>
-      </w:r>
-      <w:r>
-        <w:rPr>
-          <w:rStyle w:val="translatable-message"/>
-          <w:rFonts w:ascii="Times New Roman" w:hAnsi="Times New Roman" w:cs="Times New Roman"/>
-          <w:sz w:val="28"/>
-          <w:szCs w:val="28"/>
-        </w:rPr>
-        <w:t>.202</w:t>
-      </w:r>
-      <w:r>
-        <w:rPr>
-          <w:rStyle w:val="translatable-message"/>
-          <w:rFonts w:ascii="Times New Roman" w:hAnsi="Times New Roman" w:cs="Times New Roman"/>
-          <w:sz w:val="28"/>
-          <w:szCs w:val="28"/>
-        </w:rPr>
-        <w:t>5</w:t>
-      </w:r>
-      <w:r>
-        <w:rPr>
-          <w:rStyle w:val="translatable-message"/>
-          <w:rFonts w:ascii="Times New Roman" w:hAnsi="Times New Roman" w:cs="Times New Roman"/>
-          <w:sz w:val="28"/>
-          <w:szCs w:val="28"/>
-        </w:rPr>
         <w:t xml:space="preserve"> – </w:t>
       </w:r>
       <w:r>
@@ -205,7 +196,16 @@
           <w:sz w:val="28"/>
           <w:szCs w:val="28"/>
         </w:rPr>
-        <w:t>11</w:t>
+        <w:t>1</w:t>
+      </w:r>
+      <w:r>
+        <w:rPr>
+          <w:rStyle w:val="translatable-message"/>
+          <w:rFonts w:ascii="Times New Roman" w:hAnsi="Times New Roman" w:cs="Times New Roman"/>
+          <w:sz w:val="28"/>
+          <w:szCs w:val="28"/>
+        </w:rPr>
+        <w:t>9</w:t>
       </w:r>
       <w:r>
         <w:rPr>
@@ -433,7 +433,7 @@
           <w:sz w:val="28"/>
           <w:szCs w:val="28"/>
         </w:rPr>
-        <w:t>25</w:t>
+        <w:t>40</w:t>
       </w:r>
       <w:r>
         <w:rPr>
@@ -514,25 +514,26 @@
           <w:sz w:val="28"/>
           <w:szCs w:val="28"/>
         </w:rPr>
-        <w:t>(</w:t>
-      </w:r>
-      <w:r>
-        <w:rPr>
-          <w:rStyle w:val="translatable-message"/>
-          <w:rFonts w:ascii="Times New Roman" w:hAnsi="Times New Roman" w:cs="Times New Roman"/>
-          <w:sz w:val="28"/>
-          <w:szCs w:val="28"/>
-        </w:rPr>
-        <w:t>Бекенд</w:t>
-      </w:r>
-      <w:r>
-        <w:rPr>
-          <w:rStyle w:val="translatable-message"/>
-          <w:rFonts w:ascii="Times New Roman" w:hAnsi="Times New Roman" w:cs="Times New Roman"/>
-          <w:sz w:val="28"/>
-          <w:szCs w:val="28"/>
-        </w:rPr>
-        <w:t>)</w:t>
+        <w:t xml:space="preserve">- </w:t>
+      </w:r>
+      <w:r>
+        <w:rPr>
+          <w:rStyle w:val="translatable-message"/>
+          <w:rFonts w:ascii="Times New Roman" w:hAnsi="Times New Roman" w:cs="Times New Roman"/>
+          <w:sz w:val="28"/>
+          <w:szCs w:val="28"/>
+        </w:rPr>
+        <w:t>Сверстаны фрагменты: «Коллекция», «Автоматический режим генерации», «Галерея</w:t>
+      </w:r>
+      <w:proofErr w:type="gramStart"/>
+      <w:r>
+        <w:rPr>
+          <w:rStyle w:val="translatable-message"/>
+          <w:rFonts w:ascii="Times New Roman" w:hAnsi="Times New Roman" w:cs="Times New Roman"/>
+          <w:sz w:val="28"/>
+          <w:szCs w:val="28"/>
+        </w:rPr>
+        <w:t>»;</w:t>
       </w:r>
       <w:r>
         <w:rPr>
@@ -542,44 +543,223 @@
           <w:szCs w:val="28"/>
         </w:rPr>
         <w:br/>
-      </w:r>
-      <w:r>
-        <w:rPr>
-          <w:rStyle w:val="translatable-message"/>
-          <w:rFonts w:ascii="Times New Roman" w:hAnsi="Times New Roman" w:cs="Times New Roman"/>
-          <w:sz w:val="28"/>
-          <w:szCs w:val="28"/>
-        </w:rPr>
-        <w:t xml:space="preserve">- Создана базовая архитектура </w:t>
-      </w:r>
-      <w:proofErr w:type="spellStart"/>
-      <w:r>
-        <w:rPr>
-          <w:rStyle w:val="translatable-message"/>
-          <w:rFonts w:ascii="Times New Roman" w:hAnsi="Times New Roman" w:cs="Times New Roman"/>
-          <w:sz w:val="28"/>
-          <w:szCs w:val="28"/>
-        </w:rPr>
-        <w:t>бэкэнд</w:t>
-      </w:r>
-      <w:proofErr w:type="spellEnd"/>
-      <w:r>
-        <w:rPr>
-          <w:rStyle w:val="translatable-message"/>
-          <w:rFonts w:ascii="Times New Roman" w:hAnsi="Times New Roman" w:cs="Times New Roman"/>
-          <w:sz w:val="28"/>
-          <w:szCs w:val="28"/>
-        </w:rPr>
-        <w:t xml:space="preserve"> части</w:t>
-      </w:r>
-      <w:r>
-        <w:rPr>
-          <w:rStyle w:val="translatable-message"/>
-          <w:rFonts w:ascii="Times New Roman" w:hAnsi="Times New Roman" w:cs="Times New Roman"/>
-          <w:sz w:val="28"/>
-          <w:szCs w:val="28"/>
-        </w:rPr>
-        <w:t>;</w:t>
+        <w:t>-</w:t>
+      </w:r>
+      <w:proofErr w:type="gramEnd"/>
+      <w:r>
+        <w:rPr>
+          <w:rStyle w:val="translatable-message"/>
+          <w:rFonts w:ascii="Times New Roman" w:hAnsi="Times New Roman" w:cs="Times New Roman"/>
+          <w:sz w:val="28"/>
+          <w:szCs w:val="28"/>
+        </w:rPr>
+        <w:t xml:space="preserve"> Сделаны</w:t>
+      </w:r>
+      <w:r>
+        <w:rPr>
+          <w:rStyle w:val="translatable-message"/>
+          <w:rFonts w:ascii="Times New Roman" w:hAnsi="Times New Roman" w:cs="Times New Roman"/>
+          <w:sz w:val="28"/>
+          <w:szCs w:val="28"/>
+        </w:rPr>
+        <w:t xml:space="preserve"> </w:t>
+      </w:r>
+      <w:r>
+        <w:rPr>
+          <w:rStyle w:val="translatable-message"/>
+          <w:rFonts w:ascii="Times New Roman" w:hAnsi="Times New Roman" w:cs="Times New Roman"/>
+          <w:sz w:val="28"/>
+          <w:szCs w:val="28"/>
+          <w:lang w:val="en-US"/>
+        </w:rPr>
+        <w:t>API</w:t>
+      </w:r>
+      <w:r>
+        <w:rPr>
+          <w:rStyle w:val="translatable-message"/>
+          <w:rFonts w:ascii="Times New Roman" w:hAnsi="Times New Roman" w:cs="Times New Roman"/>
+          <w:sz w:val="28"/>
+          <w:szCs w:val="28"/>
+        </w:rPr>
+        <w:t xml:space="preserve"> </w:t>
+      </w:r>
+      <w:r>
+        <w:rPr>
+          <w:rStyle w:val="translatable-message"/>
+          <w:rFonts w:ascii="Times New Roman" w:hAnsi="Times New Roman" w:cs="Times New Roman"/>
+          <w:sz w:val="28"/>
+          <w:szCs w:val="28"/>
+        </w:rPr>
+        <w:t>интерфейсы</w:t>
+      </w:r>
+      <w:r>
+        <w:rPr>
+          <w:rStyle w:val="translatable-message"/>
+          <w:rFonts w:ascii="Times New Roman" w:hAnsi="Times New Roman" w:cs="Times New Roman"/>
+          <w:sz w:val="28"/>
+          <w:szCs w:val="28"/>
+        </w:rPr>
+        <w:t xml:space="preserve"> </w:t>
+      </w:r>
+      <w:r>
+        <w:rPr>
+          <w:rStyle w:val="translatable-message"/>
+          <w:rFonts w:ascii="Times New Roman" w:hAnsi="Times New Roman" w:cs="Times New Roman"/>
+          <w:sz w:val="28"/>
+          <w:szCs w:val="28"/>
+        </w:rPr>
+        <w:t>для</w:t>
+      </w:r>
+      <w:r>
+        <w:rPr>
+          <w:rStyle w:val="translatable-message"/>
+          <w:rFonts w:ascii="Times New Roman" w:hAnsi="Times New Roman" w:cs="Times New Roman"/>
+          <w:sz w:val="28"/>
+          <w:szCs w:val="28"/>
+        </w:rPr>
+        <w:t xml:space="preserve"> </w:t>
+      </w:r>
+      <w:r>
+        <w:rPr>
+          <w:rStyle w:val="translatable-message"/>
+          <w:rFonts w:ascii="Times New Roman" w:hAnsi="Times New Roman" w:cs="Times New Roman"/>
+          <w:sz w:val="28"/>
+          <w:szCs w:val="28"/>
+          <w:lang w:val="en-US"/>
+        </w:rPr>
+        <w:t>Tone</w:t>
+      </w:r>
+      <w:r>
+        <w:rPr>
+          <w:rStyle w:val="translatable-message"/>
+          <w:rFonts w:ascii="Times New Roman" w:hAnsi="Times New Roman" w:cs="Times New Roman"/>
+          <w:sz w:val="28"/>
+          <w:szCs w:val="28"/>
+        </w:rPr>
+        <w:t xml:space="preserve"> </w:t>
+      </w:r>
+      <w:r>
+        <w:rPr>
+          <w:rStyle w:val="translatable-message"/>
+          <w:rFonts w:ascii="Times New Roman" w:hAnsi="Times New Roman" w:cs="Times New Roman"/>
+          <w:sz w:val="28"/>
+          <w:szCs w:val="28"/>
+          <w:lang w:val="en-US"/>
+        </w:rPr>
+        <w:t>NN</w:t>
+      </w:r>
+      <w:r>
+        <w:rPr>
+          <w:rStyle w:val="translatable-message"/>
+          <w:rFonts w:ascii="Times New Roman" w:hAnsi="Times New Roman" w:cs="Times New Roman"/>
+          <w:sz w:val="28"/>
+          <w:szCs w:val="28"/>
+        </w:rPr>
+        <w:t xml:space="preserve"> </w:t>
+      </w:r>
+      <w:r>
+        <w:rPr>
+          <w:rStyle w:val="translatable-message"/>
+          <w:rFonts w:ascii="Times New Roman" w:hAnsi="Times New Roman" w:cs="Times New Roman"/>
+          <w:sz w:val="28"/>
+          <w:szCs w:val="28"/>
+        </w:rPr>
+        <w:t>и</w:t>
+      </w:r>
+      <w:r>
+        <w:rPr>
+          <w:rStyle w:val="translatable-message"/>
+          <w:rFonts w:ascii="Times New Roman" w:hAnsi="Times New Roman" w:cs="Times New Roman"/>
+          <w:sz w:val="28"/>
+          <w:szCs w:val="28"/>
+        </w:rPr>
+        <w:t xml:space="preserve"> </w:t>
+      </w:r>
+      <w:r>
+        <w:rPr>
+          <w:rStyle w:val="translatable-message"/>
+          <w:rFonts w:ascii="Times New Roman" w:hAnsi="Times New Roman" w:cs="Times New Roman"/>
+          <w:sz w:val="28"/>
+          <w:szCs w:val="28"/>
+          <w:lang w:val="en-US"/>
+        </w:rPr>
+        <w:t>Audio</w:t>
+      </w:r>
+      <w:r>
+        <w:rPr>
+          <w:rStyle w:val="translatable-message"/>
+          <w:rFonts w:ascii="Times New Roman" w:hAnsi="Times New Roman" w:cs="Times New Roman"/>
+          <w:sz w:val="28"/>
+          <w:szCs w:val="28"/>
+        </w:rPr>
+        <w:t>-</w:t>
+      </w:r>
+      <w:r>
+        <w:rPr>
+          <w:rStyle w:val="translatable-message"/>
+          <w:rFonts w:ascii="Times New Roman" w:hAnsi="Times New Roman" w:cs="Times New Roman"/>
+          <w:sz w:val="28"/>
+          <w:szCs w:val="28"/>
+          <w:lang w:val="en-US"/>
+        </w:rPr>
+        <w:t>to</w:t>
+      </w:r>
+      <w:r>
+        <w:rPr>
+          <w:rStyle w:val="translatable-message"/>
+          <w:rFonts w:ascii="Times New Roman" w:hAnsi="Times New Roman" w:cs="Times New Roman"/>
+          <w:sz w:val="28"/>
+          <w:szCs w:val="28"/>
+        </w:rPr>
+        <w:t>-</w:t>
+      </w:r>
+      <w:r>
+        <w:rPr>
+          <w:rStyle w:val="translatable-message"/>
+          <w:rFonts w:ascii="Times New Roman" w:hAnsi="Times New Roman" w:cs="Times New Roman"/>
+          <w:sz w:val="28"/>
+          <w:szCs w:val="28"/>
+          <w:lang w:val="en-US"/>
+        </w:rPr>
+        <w:t>text</w:t>
+      </w:r>
+      <w:r>
+        <w:rPr>
+          <w:rStyle w:val="translatable-message"/>
+          <w:rFonts w:ascii="Times New Roman" w:hAnsi="Times New Roman" w:cs="Times New Roman"/>
+          <w:sz w:val="28"/>
+          <w:szCs w:val="28"/>
+        </w:rPr>
+        <w:t xml:space="preserve"> </w:t>
+      </w:r>
+      <w:r>
+        <w:rPr>
+          <w:rStyle w:val="translatable-message"/>
+          <w:rFonts w:ascii="Times New Roman" w:hAnsi="Times New Roman" w:cs="Times New Roman"/>
+          <w:sz w:val="28"/>
+          <w:szCs w:val="28"/>
+          <w:lang w:val="en-US"/>
+        </w:rPr>
+        <w:t>NN</w:t>
+      </w:r>
+      <w:r>
+        <w:rPr>
+          <w:rStyle w:val="translatable-message"/>
+          <w:rFonts w:ascii="Times New Roman" w:hAnsi="Times New Roman" w:cs="Times New Roman"/>
+          <w:sz w:val="28"/>
+          <w:szCs w:val="28"/>
+        </w:rPr>
+        <w:t>.</w:t>
+      </w:r>
+      <w:r>
+        <w:rPr>
+          <w:rStyle w:val="translatable-message"/>
+          <w:rFonts w:ascii="Times New Roman" w:hAnsi="Times New Roman" w:cs="Times New Roman"/>
+          <w:sz w:val="28"/>
+          <w:szCs w:val="28"/>
+        </w:rPr>
+        <w:br/>
+        <w:t>- Сделан дизайн для всех состояний экранов «Регистрация» и «Авторизация».</w:t>
       </w:r>
     </w:p>
     <w:p>
@@ -588,55 +768,30 @@
         <w:rPr>
           <w:rStyle w:val="translatable-message"/>
           <w:rFonts w:ascii="Times New Roman" w:hAnsi="Times New Roman" w:cs="Times New Roman"/>
-          <w:sz w:val="28"/>
-          <w:szCs w:val="28"/>
-        </w:rPr>
-      </w:pPr>
-      <w:r>
-        <w:rPr>
-          <w:rStyle w:val="translatable-message"/>
-          <w:rFonts w:ascii="Times New Roman" w:hAnsi="Times New Roman" w:cs="Times New Roman"/>
-          <w:sz w:val="28"/>
-          <w:szCs w:val="28"/>
-        </w:rPr>
-        <w:t xml:space="preserve">- Создана базовая архитектура </w:t>
-      </w:r>
-      <w:r>
-        <w:rPr>
-          <w:rStyle w:val="translatable-message"/>
-          <w:rFonts w:ascii="Times New Roman" w:hAnsi="Times New Roman" w:cs="Times New Roman"/>
-          <w:sz w:val="28"/>
-          <w:szCs w:val="28"/>
-          <w:lang w:val="en-US"/>
-        </w:rPr>
-        <w:t>android</w:t>
-      </w:r>
-      <w:r>
-        <w:rPr>
-          <w:rStyle w:val="translatable-message"/>
-          <w:rFonts w:ascii="Times New Roman" w:hAnsi="Times New Roman" w:cs="Times New Roman"/>
-          <w:sz w:val="28"/>
-          <w:szCs w:val="28"/>
-        </w:rPr>
-        <w:t xml:space="preserve"> </w:t>
-      </w:r>
-      <w:r>
-        <w:rPr>
-          <w:rStyle w:val="translatable-message"/>
-          <w:rFonts w:ascii="Times New Roman" w:hAnsi="Times New Roman" w:cs="Times New Roman"/>
-          <w:sz w:val="28"/>
-          <w:szCs w:val="28"/>
-        </w:rPr>
-        <w:t>части</w:t>
-      </w:r>
-      <w:r>
-        <w:rPr>
-          <w:rStyle w:val="translatable-message"/>
-          <w:rFonts w:ascii="Times New Roman" w:hAnsi="Times New Roman" w:cs="Times New Roman"/>
-          <w:sz w:val="28"/>
-          <w:szCs w:val="28"/>
-        </w:rPr>
-        <w:t>;</w:t>
+          <w:b/>
+          <w:sz w:val="28"/>
+          <w:szCs w:val="28"/>
+        </w:rPr>
+      </w:pPr>
+      <w:r>
+        <w:rPr>
+          <w:rStyle w:val="translatable-message"/>
+          <w:rFonts w:ascii="Times New Roman" w:hAnsi="Times New Roman" w:cs="Times New Roman"/>
+          <w:b/>
+          <w:sz w:val="28"/>
+          <w:szCs w:val="28"/>
+        </w:rPr>
+        <w:t xml:space="preserve">2. Текущие задачи и проблемы </w:t>
+      </w:r>
+      <w:r>
+        <w:rPr>
+          <w:rStyle w:val="translatable-message"/>
+          <w:rFonts w:ascii="Times New Roman" w:hAnsi="Times New Roman" w:cs="Times New Roman"/>
+          <w:b/>
+          <w:sz w:val="28"/>
+          <w:szCs w:val="28"/>
+        </w:rPr>
+        <w:t>в работе:</w:t>
       </w:r>
     </w:p>
     <w:p>
@@ -656,37 +811,16 @@
           <w:sz w:val="28"/>
           <w:szCs w:val="28"/>
         </w:rPr>
-        <w:t xml:space="preserve">- Настроен </w:t>
-      </w:r>
-      <w:proofErr w:type="spellStart"/>
-      <w:r>
-        <w:rPr>
-          <w:rStyle w:val="translatable-message"/>
-          <w:rFonts w:ascii="Times New Roman" w:hAnsi="Times New Roman" w:cs="Times New Roman"/>
-          <w:sz w:val="28"/>
-          <w:szCs w:val="28"/>
-          <w:lang w:val="en-US"/>
-        </w:rPr>
-        <w:t>gradle</w:t>
-      </w:r>
-      <w:proofErr w:type="spellEnd"/>
-      <w:r>
-        <w:rPr>
-          <w:rStyle w:val="translatable-message"/>
-          <w:rFonts w:ascii="Times New Roman" w:hAnsi="Times New Roman" w:cs="Times New Roman"/>
-          <w:sz w:val="28"/>
-          <w:szCs w:val="28"/>
-        </w:rPr>
-        <w:t xml:space="preserve"> </w:t>
-      </w:r>
-      <w:r>
-        <w:rPr>
-          <w:rStyle w:val="translatable-message"/>
-          <w:rFonts w:ascii="Times New Roman" w:hAnsi="Times New Roman" w:cs="Times New Roman"/>
-          <w:sz w:val="28"/>
-          <w:szCs w:val="28"/>
-        </w:rPr>
-        <w:t>для ускорения сборки проекта.</w:t>
+        <w:t>Задачи</w:t>
+      </w:r>
+      <w:r>
+        <w:rPr>
+          <w:rStyle w:val="translatable-message"/>
+          <w:rFonts w:ascii="Times New Roman" w:hAnsi="Times New Roman" w:cs="Times New Roman"/>
+          <w:sz w:val="28"/>
+          <w:szCs w:val="28"/>
+        </w:rPr>
+        <w:t>:</w:t>
       </w:r>
     </w:p>
     <w:p>
@@ -706,44 +840,45 @@
           <w:sz w:val="28"/>
           <w:szCs w:val="28"/>
         </w:rPr>
-        <w:t>(</w:t>
-      </w:r>
-      <w:r>
-        <w:rPr>
-          <w:rStyle w:val="translatable-message"/>
-          <w:rFonts w:ascii="Times New Roman" w:hAnsi="Times New Roman" w:cs="Times New Roman"/>
-          <w:sz w:val="28"/>
-          <w:szCs w:val="28"/>
-        </w:rPr>
-        <w:t>Фронтенд</w:t>
-      </w:r>
-      <w:r>
-        <w:rPr>
-          <w:rStyle w:val="translatable-message"/>
-          <w:rFonts w:ascii="Times New Roman" w:hAnsi="Times New Roman" w:cs="Times New Roman"/>
-          <w:sz w:val="28"/>
-          <w:szCs w:val="28"/>
-        </w:rPr>
-        <w:t>)</w:t>
-      </w:r>
-      <w:r>
-        <w:rPr>
-          <w:rStyle w:val="translatable-message"/>
-          <w:rFonts w:ascii="Times New Roman" w:hAnsi="Times New Roman" w:cs="Times New Roman"/>
-          <w:sz w:val="28"/>
-          <w:szCs w:val="28"/>
-        </w:rPr>
-        <w:br/>
-        <w:t xml:space="preserve">- </w:t>
-      </w:r>
-      <w:r>
-        <w:rPr>
-          <w:rStyle w:val="translatable-message"/>
-          <w:rFonts w:ascii="Times New Roman" w:hAnsi="Times New Roman" w:cs="Times New Roman"/>
-          <w:sz w:val="28"/>
-          <w:szCs w:val="28"/>
-        </w:rPr>
-        <w:t>Настроены цвета темной и светлой темы;</w:t>
+        <w:t xml:space="preserve">- Сверстать основные экраны </w:t>
+      </w:r>
+      <w:proofErr w:type="spellStart"/>
+      <w:r>
+        <w:rPr>
+          <w:rStyle w:val="translatable-message"/>
+          <w:rFonts w:ascii="Times New Roman" w:hAnsi="Times New Roman" w:cs="Times New Roman"/>
+          <w:sz w:val="28"/>
+          <w:szCs w:val="28"/>
+        </w:rPr>
+        <w:t>андроид</w:t>
+      </w:r>
+      <w:proofErr w:type="spellEnd"/>
+      <w:r>
+        <w:rPr>
+          <w:rStyle w:val="translatable-message"/>
+          <w:rFonts w:ascii="Times New Roman" w:hAnsi="Times New Roman" w:cs="Times New Roman"/>
+          <w:sz w:val="28"/>
+          <w:szCs w:val="28"/>
+        </w:rPr>
+        <w:t xml:space="preserve"> приложения для подготовки к реализации основной логики проекта:</w:t>
+      </w:r>
+      <w:r>
+        <w:rPr>
+          <w:rStyle w:val="translatable-message"/>
+          <w:rFonts w:ascii="Times New Roman" w:hAnsi="Times New Roman" w:cs="Times New Roman"/>
+          <w:sz w:val="28"/>
+          <w:szCs w:val="28"/>
+        </w:rPr>
+        <w:t xml:space="preserve"> генерации обложек по запросу, просмотру </w:t>
+      </w:r>
+      <w:r>
+        <w:rPr>
+          <w:rStyle w:val="translatable-message"/>
+          <w:rFonts w:ascii="Times New Roman" w:hAnsi="Times New Roman" w:cs="Times New Roman"/>
+          <w:sz w:val="28"/>
+          <w:szCs w:val="28"/>
+        </w:rPr>
+        <w:t>обложек других пользователей;</w:t>
       </w:r>
     </w:p>
     <w:p>
@@ -763,8 +898,56 @@
           <w:sz w:val="28"/>
           <w:szCs w:val="28"/>
         </w:rPr>
-        <w:t>- Сверстан фрагмент «Главный экран»;</w:t>
-      </w:r>
+        <w:t xml:space="preserve">- </w:t>
+      </w:r>
+      <w:r>
+        <w:rPr>
+          <w:rStyle w:val="translatable-message"/>
+          <w:rFonts w:ascii="Times New Roman" w:hAnsi="Times New Roman" w:cs="Times New Roman"/>
+          <w:sz w:val="28"/>
+          <w:szCs w:val="28"/>
+        </w:rPr>
+        <w:t>Создать дизайны всех состояний экранов для их дальнейшей верстки;</w:t>
+      </w:r>
+      <w:r>
+        <w:rPr>
+          <w:rStyle w:val="translatable-message"/>
+          <w:rFonts w:ascii="Times New Roman" w:hAnsi="Times New Roman" w:cs="Times New Roman"/>
+          <w:sz w:val="28"/>
+          <w:szCs w:val="28"/>
+        </w:rPr>
+        <w:br/>
+        <w:t>- Создать план тестирования по техническому заданию;</w:t>
+      </w:r>
+      <w:r>
+        <w:rPr>
+          <w:rStyle w:val="translatable-message"/>
+          <w:rFonts w:ascii="Times New Roman" w:hAnsi="Times New Roman" w:cs="Times New Roman"/>
+          <w:sz w:val="28"/>
+          <w:szCs w:val="28"/>
+        </w:rPr>
+        <w:br/>
+      </w:r>
+      <w:r>
+        <w:rPr>
+          <w:rStyle w:val="translatable-message"/>
+          <w:rFonts w:ascii="Times New Roman" w:hAnsi="Times New Roman" w:cs="Times New Roman"/>
+          <w:sz w:val="28"/>
+          <w:szCs w:val="28"/>
+        </w:rPr>
+        <w:t xml:space="preserve">- </w:t>
+      </w:r>
+      <w:r>
+        <w:rPr>
+          <w:rStyle w:val="translatable-message"/>
+          <w:rFonts w:ascii="Times New Roman" w:hAnsi="Times New Roman" w:cs="Times New Roman"/>
+          <w:sz w:val="28"/>
+          <w:szCs w:val="28"/>
+        </w:rPr>
+        <w:t>Сверстать веб админ панель.</w:t>
+      </w:r>
+      <w:bookmarkStart w:id="0" w:name="_GoBack"/>
+      <w:bookmarkEnd w:id="0"/>
     </w:p>
     <w:p>
       <w:pPr>
@@ -772,18 +955,20 @@
         <w:rPr>
           <w:rStyle w:val="translatable-message"/>
           <w:rFonts w:ascii="Times New Roman" w:hAnsi="Times New Roman" w:cs="Times New Roman"/>
-          <w:sz w:val="28"/>
-          <w:szCs w:val="28"/>
-        </w:rPr>
-      </w:pPr>
-      <w:r>
-        <w:rPr>
-          <w:rStyle w:val="translatable-message"/>
-          <w:rFonts w:ascii="Times New Roman" w:hAnsi="Times New Roman" w:cs="Times New Roman"/>
-          <w:sz w:val="28"/>
-          <w:szCs w:val="28"/>
-        </w:rPr>
-        <w:t>- Создан дизайн всех состояний фрагмента «Галерея работ»;</w:t>
+          <w:b/>
+          <w:sz w:val="28"/>
+          <w:szCs w:val="28"/>
+        </w:rPr>
+      </w:pPr>
+      <w:r>
+        <w:rPr>
+          <w:rStyle w:val="translatable-message"/>
+          <w:rFonts w:ascii="Times New Roman" w:hAnsi="Times New Roman" w:cs="Times New Roman"/>
+          <w:b/>
+          <w:sz w:val="28"/>
+          <w:szCs w:val="28"/>
+        </w:rPr>
+        <w:t>3. План на следующую неделю</w:t>
       </w:r>
     </w:p>
     <w:p>
@@ -803,26 +988,7 @@
           <w:sz w:val="28"/>
           <w:szCs w:val="28"/>
         </w:rPr>
-        <w:t xml:space="preserve">- Создан дизайн </w:t>
-      </w:r>
-      <w:r>
-        <w:rPr>
-          <w:rStyle w:val="translatable-message"/>
-          <w:rFonts w:ascii="Times New Roman" w:hAnsi="Times New Roman" w:cs="Times New Roman"/>
-          <w:sz w:val="28"/>
-          <w:szCs w:val="28"/>
-          <w:lang w:val="en-US"/>
-        </w:rPr>
-        <w:t>Admin Panel</w:t>
-      </w:r>
-      <w:r>
-        <w:rPr>
-          <w:rStyle w:val="translatable-message"/>
-          <w:rFonts w:ascii="Times New Roman" w:hAnsi="Times New Roman" w:cs="Times New Roman"/>
-          <w:sz w:val="28"/>
-          <w:szCs w:val="28"/>
-        </w:rPr>
-        <w:t>;</w:t>
+        <w:t>Приоритеты:</w:t>
       </w:r>
     </w:p>
     <w:p>
@@ -831,30 +997,142 @@
         <w:rPr>
           <w:rStyle w:val="translatable-message"/>
           <w:rFonts w:ascii="Times New Roman" w:hAnsi="Times New Roman" w:cs="Times New Roman"/>
-          <w:b/>
-          <w:sz w:val="28"/>
-          <w:szCs w:val="28"/>
-        </w:rPr>
-      </w:pPr>
-      <w:r>
-        <w:rPr>
-          <w:rStyle w:val="translatable-message"/>
-          <w:rFonts w:ascii="Times New Roman" w:hAnsi="Times New Roman" w:cs="Times New Roman"/>
-          <w:b/>
-          <w:sz w:val="28"/>
-          <w:szCs w:val="28"/>
-        </w:rPr>
-        <w:t xml:space="preserve">2. Текущие задачи и проблемы </w:t>
-      </w:r>
-      <w:r>
-        <w:rPr>
-          <w:rStyle w:val="translatable-message"/>
-          <w:rFonts w:ascii="Times New Roman" w:hAnsi="Times New Roman" w:cs="Times New Roman"/>
-          <w:b/>
-          <w:sz w:val="28"/>
-          <w:szCs w:val="28"/>
-        </w:rPr>
-        <w:t>в работе:</w:t>
+          <w:sz w:val="28"/>
+          <w:szCs w:val="28"/>
+        </w:rPr>
+      </w:pPr>
+      <w:r>
+        <w:rPr>
+          <w:rStyle w:val="translatable-message"/>
+          <w:rFonts w:ascii="Times New Roman" w:hAnsi="Times New Roman" w:cs="Times New Roman"/>
+          <w:sz w:val="28"/>
+          <w:szCs w:val="28"/>
+        </w:rPr>
+        <w:t xml:space="preserve">- </w:t>
+      </w:r>
+      <w:r>
+        <w:rPr>
+          <w:rStyle w:val="translatable-message"/>
+          <w:rFonts w:ascii="Times New Roman" w:hAnsi="Times New Roman" w:cs="Times New Roman"/>
+          <w:sz w:val="28"/>
+          <w:szCs w:val="28"/>
+        </w:rPr>
+        <w:t>Сделать дизайн всех состояний экрана «Генерация</w:t>
+      </w:r>
+      <w:proofErr w:type="gramStart"/>
+      <w:r>
+        <w:rPr>
+          <w:rStyle w:val="translatable-message"/>
+          <w:rFonts w:ascii="Times New Roman" w:hAnsi="Times New Roman" w:cs="Times New Roman"/>
+          <w:sz w:val="28"/>
+          <w:szCs w:val="28"/>
+        </w:rPr>
+        <w:t>»;</w:t>
+      </w:r>
+      <w:r>
+        <w:rPr>
+          <w:rStyle w:val="translatable-message"/>
+          <w:rFonts w:ascii="Times New Roman" w:hAnsi="Times New Roman" w:cs="Times New Roman"/>
+          <w:sz w:val="28"/>
+          <w:szCs w:val="28"/>
+        </w:rPr>
+        <w:br/>
+        <w:t>-</w:t>
+      </w:r>
+      <w:proofErr w:type="gramEnd"/>
+      <w:r>
+        <w:rPr>
+          <w:rStyle w:val="translatable-message"/>
+          <w:rFonts w:ascii="Times New Roman" w:hAnsi="Times New Roman" w:cs="Times New Roman"/>
+          <w:sz w:val="28"/>
+          <w:szCs w:val="28"/>
+        </w:rPr>
+        <w:t xml:space="preserve"> Сверстать экраны «Регистрация», «Авторизация»</w:t>
+      </w:r>
+      <w:r>
+        <w:rPr>
+          <w:rStyle w:val="translatable-message"/>
+          <w:rFonts w:ascii="Times New Roman" w:hAnsi="Times New Roman" w:cs="Times New Roman"/>
+          <w:sz w:val="28"/>
+          <w:szCs w:val="28"/>
+        </w:rPr>
+        <w:t xml:space="preserve"> и «Генерация»;</w:t>
+      </w:r>
+      <w:r>
+        <w:rPr>
+          <w:rStyle w:val="translatable-message"/>
+          <w:rFonts w:ascii="Times New Roman" w:hAnsi="Times New Roman" w:cs="Times New Roman"/>
+          <w:sz w:val="28"/>
+          <w:szCs w:val="28"/>
+        </w:rPr>
+        <w:br/>
+      </w:r>
+      <w:r>
+        <w:rPr>
+          <w:rStyle w:val="translatable-message"/>
+          <w:rFonts w:ascii="Times New Roman" w:hAnsi="Times New Roman" w:cs="Times New Roman"/>
+          <w:sz w:val="28"/>
+          <w:szCs w:val="28"/>
+        </w:rPr>
+        <w:t>- Сделать</w:t>
+      </w:r>
+      <w:r>
+        <w:t xml:space="preserve"> </w:t>
+      </w:r>
+      <w:r>
+        <w:rPr>
+          <w:rStyle w:val="translatable-message"/>
+          <w:rFonts w:ascii="Times New Roman" w:hAnsi="Times New Roman" w:cs="Times New Roman"/>
+          <w:sz w:val="28"/>
+          <w:szCs w:val="28"/>
+        </w:rPr>
+        <w:t>м</w:t>
+      </w:r>
+      <w:r>
+        <w:rPr>
+          <w:rStyle w:val="translatable-message"/>
+          <w:rFonts w:ascii="Times New Roman" w:hAnsi="Times New Roman" w:cs="Times New Roman"/>
+          <w:sz w:val="28"/>
+          <w:szCs w:val="28"/>
+        </w:rPr>
+        <w:t>акет отображения информации об элементах БД в админ панел</w:t>
+      </w:r>
+      <w:r>
+        <w:rPr>
+          <w:rStyle w:val="translatable-message"/>
+          <w:rFonts w:ascii="Times New Roman" w:hAnsi="Times New Roman" w:cs="Times New Roman"/>
+          <w:sz w:val="28"/>
+          <w:szCs w:val="28"/>
+        </w:rPr>
+        <w:t>и;</w:t>
+      </w:r>
+      <w:r>
+        <w:rPr>
+          <w:rStyle w:val="translatable-message"/>
+          <w:rFonts w:ascii="Times New Roman" w:hAnsi="Times New Roman" w:cs="Times New Roman"/>
+          <w:sz w:val="28"/>
+          <w:szCs w:val="28"/>
+        </w:rPr>
+        <w:br/>
+        <w:t>- Сделать м</w:t>
+      </w:r>
+      <w:r>
+        <w:rPr>
+          <w:rStyle w:val="translatable-message"/>
+          <w:rFonts w:ascii="Times New Roman" w:hAnsi="Times New Roman" w:cs="Times New Roman"/>
+          <w:sz w:val="28"/>
+          <w:szCs w:val="28"/>
+        </w:rPr>
+        <w:t>акет авторизации для админ панели</w:t>
+      </w:r>
+      <w:r>
+        <w:rPr>
+          <w:rStyle w:val="translatable-message"/>
+          <w:rFonts w:ascii="Times New Roman" w:hAnsi="Times New Roman" w:cs="Times New Roman"/>
+          <w:sz w:val="28"/>
+          <w:szCs w:val="28"/>
+        </w:rPr>
+        <w:t>.</w:t>
       </w:r>
     </w:p>
     <w:p>
@@ -871,19 +1149,11 @@
         <w:rPr>
           <w:rStyle w:val="translatable-message"/>
           <w:rFonts w:ascii="Times New Roman" w:hAnsi="Times New Roman" w:cs="Times New Roman"/>
-          <w:sz w:val="28"/>
-          <w:szCs w:val="28"/>
-        </w:rPr>
-        <w:t>Задачи</w:t>
-      </w:r>
-      <w:r>
-        <w:rPr>
-          <w:rStyle w:val="translatable-message"/>
-          <w:rFonts w:ascii="Times New Roman" w:hAnsi="Times New Roman" w:cs="Times New Roman"/>
-          <w:sz w:val="28"/>
-          <w:szCs w:val="28"/>
-        </w:rPr>
-        <w:t>:</w:t>
+          <w:b/>
+          <w:sz w:val="28"/>
+          <w:szCs w:val="28"/>
+        </w:rPr>
+        <w:t>Метрики контроля</w:t>
       </w:r>
     </w:p>
     <w:p>
@@ -903,45 +1173,34 @@
           <w:sz w:val="28"/>
           <w:szCs w:val="28"/>
         </w:rPr>
-        <w:t xml:space="preserve">- Сверстать основные экраны </w:t>
-      </w:r>
-      <w:proofErr w:type="spellStart"/>
-      <w:r>
-        <w:rPr>
-          <w:rStyle w:val="translatable-message"/>
-          <w:rFonts w:ascii="Times New Roman" w:hAnsi="Times New Roman" w:cs="Times New Roman"/>
-          <w:sz w:val="28"/>
-          <w:szCs w:val="28"/>
-        </w:rPr>
-        <w:t>андроид</w:t>
-      </w:r>
-      <w:proofErr w:type="spellEnd"/>
-      <w:r>
-        <w:rPr>
-          <w:rStyle w:val="translatable-message"/>
-          <w:rFonts w:ascii="Times New Roman" w:hAnsi="Times New Roman" w:cs="Times New Roman"/>
-          <w:sz w:val="28"/>
-          <w:szCs w:val="28"/>
-        </w:rPr>
-        <w:t xml:space="preserve"> приложения для подготовки к реализации основной логики проекта:</w:t>
-      </w:r>
-      <w:r>
-        <w:rPr>
-          <w:rStyle w:val="translatable-message"/>
-          <w:rFonts w:ascii="Times New Roman" w:hAnsi="Times New Roman" w:cs="Times New Roman"/>
-          <w:sz w:val="28"/>
-          <w:szCs w:val="28"/>
-        </w:rPr>
-        <w:t xml:space="preserve"> генерации обложек по запросу, просмотру </w:t>
-      </w:r>
-      <w:r>
-        <w:rPr>
-          <w:rStyle w:val="translatable-message"/>
-          <w:rFonts w:ascii="Times New Roman" w:hAnsi="Times New Roman" w:cs="Times New Roman"/>
-          <w:sz w:val="28"/>
-          <w:szCs w:val="28"/>
-        </w:rPr>
-        <w:t>обложек других пользователей;</w:t>
+        <w:t>- 5</w:t>
+      </w:r>
+      <w:r>
+        <w:rPr>
+          <w:rStyle w:val="translatable-message"/>
+          <w:rFonts w:ascii="Times New Roman" w:hAnsi="Times New Roman" w:cs="Times New Roman"/>
+          <w:sz w:val="28"/>
+          <w:szCs w:val="28"/>
+        </w:rPr>
+        <w:t>0</w:t>
+      </w:r>
+      <w:r>
+        <w:rPr>
+          <w:rStyle w:val="translatable-message"/>
+          <w:rFonts w:ascii="Times New Roman" w:hAnsi="Times New Roman" w:cs="Times New Roman"/>
+          <w:sz w:val="28"/>
+          <w:szCs w:val="28"/>
+        </w:rPr>
+        <w:t>% сверстанных экранов к 26.04.2025</w:t>
+      </w:r>
+      <w:r>
+        <w:rPr>
+          <w:rStyle w:val="translatable-message"/>
+          <w:rFonts w:ascii="Times New Roman" w:hAnsi="Times New Roman" w:cs="Times New Roman"/>
+          <w:sz w:val="28"/>
+          <w:szCs w:val="28"/>
+        </w:rPr>
+        <w:t>.</w:t>
       </w:r>
     </w:p>
     <w:p>
@@ -950,27 +1209,30 @@
         <w:rPr>
           <w:rStyle w:val="translatable-message"/>
           <w:rFonts w:ascii="Times New Roman" w:hAnsi="Times New Roman" w:cs="Times New Roman"/>
-          <w:sz w:val="28"/>
-          <w:szCs w:val="28"/>
-        </w:rPr>
-      </w:pPr>
-      <w:r>
-        <w:rPr>
-          <w:rStyle w:val="translatable-message"/>
-          <w:rFonts w:ascii="Times New Roman" w:hAnsi="Times New Roman" w:cs="Times New Roman"/>
-          <w:sz w:val="28"/>
-          <w:szCs w:val="28"/>
-        </w:rPr>
-        <w:t xml:space="preserve">- </w:t>
-      </w:r>
-      <w:r>
-        <w:rPr>
-          <w:rStyle w:val="translatable-message"/>
-          <w:rFonts w:ascii="Times New Roman" w:hAnsi="Times New Roman" w:cs="Times New Roman"/>
-          <w:sz w:val="28"/>
-          <w:szCs w:val="28"/>
-        </w:rPr>
-        <w:t>Создать дизайны всех состояний экранов для их дальнейшей верстки;</w:t>
+          <w:b/>
+          <w:sz w:val="28"/>
+          <w:szCs w:val="28"/>
+        </w:rPr>
+      </w:pPr>
+      <w:r>
+        <w:rPr>
+          <w:rStyle w:val="translatable-message"/>
+          <w:rFonts w:ascii="Times New Roman" w:hAnsi="Times New Roman" w:cs="Times New Roman"/>
+          <w:b/>
+          <w:sz w:val="28"/>
+          <w:szCs w:val="28"/>
+        </w:rPr>
+        <w:t>4</w:t>
+      </w:r>
+      <w:r>
+        <w:rPr>
+          <w:rStyle w:val="translatable-message"/>
+          <w:rFonts w:ascii="Times New Roman" w:hAnsi="Times New Roman" w:cs="Times New Roman"/>
+          <w:b/>
+          <w:sz w:val="28"/>
+          <w:szCs w:val="28"/>
+        </w:rPr>
+        <w:t>. Заключение PM</w:t>
       </w:r>
     </w:p>
     <w:p>
@@ -981,62 +1243,25 @@
           <w:rFonts w:ascii="Times New Roman" w:hAnsi="Times New Roman" w:cs="Times New Roman"/>
           <w:sz w:val="28"/>
           <w:szCs w:val="28"/>
-          <w:lang w:val="en-US"/>
-        </w:rPr>
-      </w:pPr>
-      <w:r>
-        <w:rPr>
-          <w:rStyle w:val="translatable-message"/>
-          <w:rFonts w:ascii="Times New Roman" w:hAnsi="Times New Roman" w:cs="Times New Roman"/>
-          <w:sz w:val="28"/>
-          <w:szCs w:val="28"/>
-        </w:rPr>
-        <w:t xml:space="preserve">- </w:t>
-      </w:r>
-      <w:r>
-        <w:rPr>
-          <w:rStyle w:val="translatable-message"/>
-          <w:rFonts w:ascii="Times New Roman" w:hAnsi="Times New Roman" w:cs="Times New Roman"/>
-          <w:sz w:val="28"/>
-          <w:szCs w:val="28"/>
-        </w:rPr>
-        <w:t>Р</w:t>
-      </w:r>
-      <w:r>
-        <w:rPr>
-          <w:rStyle w:val="translatable-message"/>
-          <w:rFonts w:ascii="Times New Roman" w:hAnsi="Times New Roman" w:cs="Times New Roman"/>
-          <w:sz w:val="28"/>
-          <w:szCs w:val="28"/>
-        </w:rPr>
-        <w:t>азработ</w:t>
-      </w:r>
-      <w:r>
-        <w:rPr>
-          <w:rStyle w:val="translatable-message"/>
-          <w:rFonts w:ascii="Times New Roman" w:hAnsi="Times New Roman" w:cs="Times New Roman"/>
-          <w:sz w:val="28"/>
-          <w:szCs w:val="28"/>
-        </w:rPr>
-        <w:t>ать и настроить</w:t>
-      </w:r>
-      <w:r>
-        <w:rPr>
-          <w:rStyle w:val="translatable-message"/>
-          <w:rFonts w:ascii="Times New Roman" w:hAnsi="Times New Roman" w:cs="Times New Roman"/>
-          <w:sz w:val="28"/>
-          <w:szCs w:val="28"/>
-        </w:rPr>
-        <w:t xml:space="preserve"> API, через который другие части системы см</w:t>
-      </w:r>
-      <w:r>
-        <w:rPr>
-          <w:rStyle w:val="translatable-message"/>
-          <w:rFonts w:ascii="Times New Roman" w:hAnsi="Times New Roman" w:cs="Times New Roman"/>
-          <w:sz w:val="28"/>
-          <w:szCs w:val="28"/>
-        </w:rPr>
-        <w:t>огут взаимодействовать с моделями нейронных сетей.</w:t>
+        </w:rPr>
+      </w:pPr>
+      <w:r>
+        <w:rPr>
+          <w:rStyle w:val="translatable-message"/>
+          <w:rFonts w:ascii="Times New Roman" w:hAnsi="Times New Roman" w:cs="Times New Roman"/>
+          <w:sz w:val="28"/>
+          <w:szCs w:val="28"/>
+        </w:rPr>
+        <w:t>Проект движется по плану</w:t>
+      </w:r>
+      <w:r>
+        <w:rPr>
+          <w:rStyle w:val="translatable-message"/>
+          <w:rFonts w:ascii="Times New Roman" w:hAnsi="Times New Roman" w:cs="Times New Roman"/>
+          <w:sz w:val="28"/>
+          <w:szCs w:val="28"/>
+        </w:rPr>
+        <w:t>.</w:t>
       </w:r>
     </w:p>
     <w:p>
@@ -1056,180 +1281,44 @@
           <w:sz w:val="28"/>
           <w:szCs w:val="28"/>
         </w:rPr>
-        <w:t>Проблемы</w:t>
-      </w:r>
-      <w:r>
-        <w:rPr>
-          <w:rStyle w:val="translatable-message"/>
-          <w:rFonts w:ascii="Times New Roman" w:hAnsi="Times New Roman" w:cs="Times New Roman"/>
-          <w:sz w:val="28"/>
-          <w:szCs w:val="28"/>
-        </w:rPr>
-        <w:t>:</w:t>
+        <w:t xml:space="preserve">PM проекта: </w:t>
+      </w:r>
+      <w:r>
+        <w:rPr>
+          <w:rStyle w:val="translatable-message"/>
+          <w:rFonts w:ascii="Times New Roman" w:hAnsi="Times New Roman" w:cs="Times New Roman"/>
+          <w:sz w:val="28"/>
+          <w:szCs w:val="28"/>
+        </w:rPr>
+        <w:t>Липовцев Алексей Викторович.</w:t>
+      </w:r>
+      <w:r>
+        <w:rPr>
+          <w:rStyle w:val="translatable-message"/>
+          <w:rFonts w:ascii="Times New Roman" w:hAnsi="Times New Roman" w:cs="Times New Roman"/>
+          <w:sz w:val="28"/>
+          <w:szCs w:val="28"/>
+        </w:rPr>
+        <w:t xml:space="preserve"> </w:t>
       </w:r>
     </w:p>
     <w:p>
       <w:pPr>
         <w:spacing w:line="240" w:lineRule="auto"/>
         <w:rPr>
-          <w:rStyle w:val="translatable-message"/>
-          <w:rFonts w:ascii="Times New Roman" w:hAnsi="Times New Roman" w:cs="Times New Roman"/>
-          <w:sz w:val="28"/>
-          <w:szCs w:val="28"/>
-        </w:rPr>
-      </w:pPr>
-      <w:r>
-        <w:rPr>
-          <w:rStyle w:val="translatable-message"/>
-          <w:rFonts w:ascii="Times New Roman" w:hAnsi="Times New Roman" w:cs="Times New Roman"/>
-          <w:sz w:val="28"/>
-          <w:szCs w:val="28"/>
-        </w:rPr>
-        <w:t>- пока не проявляются.</w:t>
-      </w:r>
-    </w:p>
-    <w:p>
-      <w:pPr>
-        <w:rPr>
-          <w:rStyle w:val="translatable-message"/>
-          <w:rFonts w:ascii="Times New Roman" w:hAnsi="Times New Roman" w:cs="Times New Roman"/>
-          <w:b/>
-          <w:sz w:val="28"/>
-          <w:szCs w:val="28"/>
-        </w:rPr>
-      </w:pPr>
-      <w:r>
-        <w:rPr>
-          <w:rStyle w:val="translatable-message"/>
-          <w:rFonts w:ascii="Times New Roman" w:hAnsi="Times New Roman" w:cs="Times New Roman"/>
-          <w:b/>
-          <w:sz w:val="28"/>
-          <w:szCs w:val="28"/>
-        </w:rPr>
-        <w:br w:type="page"/>
-      </w:r>
-    </w:p>
-    <w:p>
-      <w:pPr>
-        <w:spacing w:line="240" w:lineRule="auto"/>
-        <w:rPr>
-          <w:rStyle w:val="translatable-message"/>
-          <w:rFonts w:ascii="Times New Roman" w:hAnsi="Times New Roman" w:cs="Times New Roman"/>
-          <w:b/>
-          <w:sz w:val="28"/>
-          <w:szCs w:val="28"/>
-        </w:rPr>
-      </w:pPr>
-      <w:bookmarkStart w:id="0" w:name="_GoBack"/>
-      <w:bookmarkEnd w:id="0"/>
-      <w:r>
-        <w:rPr>
-          <w:rStyle w:val="translatable-message"/>
-          <w:rFonts w:ascii="Times New Roman" w:hAnsi="Times New Roman" w:cs="Times New Roman"/>
-          <w:b/>
-          <w:sz w:val="28"/>
-          <w:szCs w:val="28"/>
-        </w:rPr>
-        <w:lastRenderedPageBreak/>
-        <w:t>3. План на следующую неделю</w:t>
-      </w:r>
-    </w:p>
-    <w:p>
-      <w:pPr>
-        <w:spacing w:line="240" w:lineRule="auto"/>
-        <w:rPr>
-          <w:rStyle w:val="translatable-message"/>
-          <w:rFonts w:ascii="Times New Roman" w:hAnsi="Times New Roman" w:cs="Times New Roman"/>
-          <w:sz w:val="28"/>
-          <w:szCs w:val="28"/>
-        </w:rPr>
-      </w:pPr>
-      <w:r>
-        <w:rPr>
-          <w:rStyle w:val="translatable-message"/>
-          <w:rFonts w:ascii="Times New Roman" w:hAnsi="Times New Roman" w:cs="Times New Roman"/>
-          <w:sz w:val="28"/>
-          <w:szCs w:val="28"/>
-        </w:rPr>
-        <w:t>Приоритеты:</w:t>
-      </w:r>
-    </w:p>
-    <w:p>
-      <w:pPr>
-        <w:spacing w:line="240" w:lineRule="auto"/>
-        <w:rPr>
-          <w:rStyle w:val="translatable-message"/>
-          <w:rFonts w:ascii="Times New Roman" w:hAnsi="Times New Roman" w:cs="Times New Roman"/>
-          <w:sz w:val="28"/>
-          <w:szCs w:val="28"/>
-        </w:rPr>
-      </w:pPr>
-      <w:r>
-        <w:rPr>
-          <w:rStyle w:val="translatable-message"/>
-          <w:rFonts w:ascii="Times New Roman" w:hAnsi="Times New Roman" w:cs="Times New Roman"/>
-          <w:sz w:val="28"/>
-          <w:szCs w:val="28"/>
-        </w:rPr>
-        <w:t xml:space="preserve">- </w:t>
-      </w:r>
-      <w:r>
-        <w:rPr>
-          <w:rStyle w:val="translatable-message"/>
-          <w:rFonts w:ascii="Times New Roman" w:hAnsi="Times New Roman" w:cs="Times New Roman"/>
-          <w:sz w:val="28"/>
-          <w:szCs w:val="28"/>
-        </w:rPr>
-        <w:t>Сверстать фрагмент Галерея работ</w:t>
-      </w:r>
-      <w:r>
-        <w:rPr>
-          <w:rStyle w:val="translatable-message"/>
-          <w:rFonts w:ascii="Times New Roman" w:hAnsi="Times New Roman" w:cs="Times New Roman"/>
-          <w:sz w:val="28"/>
-          <w:szCs w:val="28"/>
-        </w:rPr>
-        <w:t>;</w:t>
-      </w:r>
-    </w:p>
-    <w:p>
-      <w:pPr>
-        <w:spacing w:line="240" w:lineRule="auto"/>
-        <w:rPr>
-          <w:rStyle w:val="translatable-message"/>
-          <w:rFonts w:ascii="Times New Roman" w:hAnsi="Times New Roman" w:cs="Times New Roman"/>
-          <w:sz w:val="28"/>
-          <w:szCs w:val="28"/>
-        </w:rPr>
-      </w:pPr>
-      <w:r>
-        <w:rPr>
-          <w:rStyle w:val="translatable-message"/>
-          <w:rFonts w:ascii="Times New Roman" w:hAnsi="Times New Roman" w:cs="Times New Roman"/>
-          <w:sz w:val="28"/>
-          <w:szCs w:val="28"/>
-        </w:rPr>
-        <w:t>- Создать дизайн всех состояний экранов «Авторизация» и «Регистрация»;</w:t>
-      </w:r>
-    </w:p>
-    <w:p>
-      <w:pPr>
-        <w:spacing w:line="240" w:lineRule="auto"/>
-        <w:rPr>
-          <w:rStyle w:val="translatable-message"/>
-          <w:rFonts w:ascii="Times New Roman" w:hAnsi="Times New Roman" w:cs="Times New Roman"/>
-          <w:sz w:val="28"/>
-          <w:szCs w:val="28"/>
-        </w:rPr>
-      </w:pPr>
-      <w:r>
-        <w:rPr>
-          <w:rStyle w:val="translatable-message"/>
-          <w:rFonts w:ascii="Times New Roman" w:hAnsi="Times New Roman" w:cs="Times New Roman"/>
-          <w:sz w:val="28"/>
-          <w:szCs w:val="28"/>
-        </w:rPr>
-        <w:t xml:space="preserve">- Создать базовую архитектуру </w:t>
+          <w:rFonts w:ascii="Times New Roman" w:hAnsi="Times New Roman" w:cs="Times New Roman"/>
+          <w:sz w:val="28"/>
+          <w:szCs w:val="28"/>
+        </w:rPr>
+      </w:pPr>
+      <w:r>
+        <w:rPr>
+          <w:rStyle w:val="translatable-message"/>
+          <w:rFonts w:ascii="Times New Roman" w:hAnsi="Times New Roman" w:cs="Times New Roman"/>
+          <w:sz w:val="28"/>
+          <w:szCs w:val="28"/>
+        </w:rPr>
+        <w:t>Дата следующего отчёта: 2</w:t>
       </w:r>
       <w:r>
         <w:rPr>
@@ -1239,342 +1328,16 @@
           <w:szCs w:val="28"/>
           <w:lang w:val="en-US"/>
         </w:rPr>
-        <w:t>Admin</w:t>
-      </w:r>
-      <w:r>
-        <w:rPr>
-          <w:rStyle w:val="translatable-message"/>
-          <w:rFonts w:ascii="Times New Roman" w:hAnsi="Times New Roman" w:cs="Times New Roman"/>
-          <w:sz w:val="28"/>
-          <w:szCs w:val="28"/>
-        </w:rPr>
-        <w:t xml:space="preserve"> </w:t>
-      </w:r>
-      <w:r>
-        <w:rPr>
-          <w:rStyle w:val="translatable-message"/>
-          <w:rFonts w:ascii="Times New Roman" w:hAnsi="Times New Roman" w:cs="Times New Roman"/>
-          <w:sz w:val="28"/>
-          <w:szCs w:val="28"/>
-          <w:lang w:val="en-US"/>
-        </w:rPr>
-        <w:t>Panel</w:t>
-      </w:r>
-      <w:r>
-        <w:rPr>
-          <w:rStyle w:val="translatable-message"/>
-          <w:rFonts w:ascii="Times New Roman" w:hAnsi="Times New Roman" w:cs="Times New Roman"/>
-          <w:sz w:val="28"/>
-          <w:szCs w:val="28"/>
-        </w:rPr>
-        <w:t xml:space="preserve"> для управления базами данных приложения;</w:t>
-      </w:r>
-    </w:p>
-    <w:p>
-      <w:pPr>
-        <w:spacing w:line="240" w:lineRule="auto"/>
-        <w:rPr>
-          <w:rStyle w:val="translatable-message"/>
-          <w:rFonts w:ascii="Times New Roman" w:hAnsi="Times New Roman" w:cs="Times New Roman"/>
-          <w:sz w:val="28"/>
-          <w:szCs w:val="28"/>
-        </w:rPr>
-      </w:pPr>
-      <w:r>
-        <w:rPr>
-          <w:rStyle w:val="translatable-message"/>
-          <w:rFonts w:ascii="Times New Roman" w:hAnsi="Times New Roman" w:cs="Times New Roman"/>
-          <w:sz w:val="28"/>
-          <w:szCs w:val="28"/>
-        </w:rPr>
-        <w:t>- Создать план тестирования по техническому заданию;</w:t>
-      </w:r>
-    </w:p>
-    <w:p>
-      <w:pPr>
-        <w:spacing w:line="240" w:lineRule="auto"/>
-        <w:rPr>
-          <w:rStyle w:val="translatable-message"/>
-          <w:rFonts w:ascii="Times New Roman" w:hAnsi="Times New Roman" w:cs="Times New Roman"/>
-          <w:b/>
-          <w:sz w:val="28"/>
-          <w:szCs w:val="28"/>
-        </w:rPr>
-      </w:pPr>
-      <w:r>
-        <w:rPr>
-          <w:rStyle w:val="translatable-message"/>
-          <w:rFonts w:ascii="Times New Roman" w:hAnsi="Times New Roman" w:cs="Times New Roman"/>
-          <w:b/>
-          <w:sz w:val="28"/>
-          <w:szCs w:val="28"/>
-        </w:rPr>
-        <w:t>4. Риски и их минимизация</w:t>
-      </w:r>
-    </w:p>
-    <w:p>
-      <w:pPr>
-        <w:spacing w:line="240" w:lineRule="auto"/>
-        <w:rPr>
-          <w:rStyle w:val="translatable-message"/>
-          <w:rFonts w:ascii="Times New Roman" w:hAnsi="Times New Roman" w:cs="Times New Roman"/>
-          <w:sz w:val="28"/>
-          <w:szCs w:val="28"/>
-        </w:rPr>
-      </w:pPr>
-      <w:r>
-        <w:rPr>
-          <w:rStyle w:val="translatable-message"/>
-          <w:rFonts w:ascii="Times New Roman" w:hAnsi="Times New Roman" w:cs="Times New Roman"/>
-          <w:sz w:val="28"/>
-          <w:szCs w:val="28"/>
-        </w:rPr>
-        <w:t xml:space="preserve">Риск: Срыв </w:t>
-      </w:r>
-      <w:proofErr w:type="spellStart"/>
-      <w:r>
-        <w:rPr>
-          <w:rStyle w:val="translatable-message"/>
-          <w:rFonts w:ascii="Times New Roman" w:hAnsi="Times New Roman" w:cs="Times New Roman"/>
-          <w:sz w:val="28"/>
-          <w:szCs w:val="28"/>
-        </w:rPr>
-        <w:t>дедлайна</w:t>
-      </w:r>
-      <w:proofErr w:type="spellEnd"/>
-      <w:r>
-        <w:rPr>
-          <w:rStyle w:val="translatable-message"/>
-          <w:rFonts w:ascii="Times New Roman" w:hAnsi="Times New Roman" w:cs="Times New Roman"/>
-          <w:sz w:val="28"/>
-          <w:szCs w:val="28"/>
-        </w:rPr>
-        <w:t xml:space="preserve"> из-за</w:t>
-      </w:r>
-      <w:r>
-        <w:rPr>
-          <w:rStyle w:val="translatable-message"/>
-          <w:rFonts w:ascii="Times New Roman" w:hAnsi="Times New Roman" w:cs="Times New Roman"/>
-          <w:sz w:val="28"/>
-          <w:szCs w:val="28"/>
-        </w:rPr>
-        <w:t xml:space="preserve"> зависимости верстки экранов приложения от дизайна.</w:t>
-      </w:r>
-    </w:p>
-    <w:p>
-      <w:pPr>
-        <w:spacing w:line="240" w:lineRule="auto"/>
-        <w:rPr>
-          <w:rStyle w:val="translatable-message"/>
-          <w:rFonts w:ascii="Times New Roman" w:hAnsi="Times New Roman" w:cs="Times New Roman"/>
-          <w:sz w:val="28"/>
-          <w:szCs w:val="28"/>
-        </w:rPr>
-      </w:pPr>
-      <w:r>
-        <w:rPr>
-          <w:rStyle w:val="translatable-message"/>
-          <w:rFonts w:ascii="Times New Roman" w:hAnsi="Times New Roman" w:cs="Times New Roman"/>
-          <w:sz w:val="28"/>
-          <w:szCs w:val="28"/>
-        </w:rPr>
-        <w:t>Решение:</w:t>
-      </w:r>
-      <w:r>
-        <w:rPr>
-          <w:rStyle w:val="translatable-message"/>
-          <w:rFonts w:ascii="Times New Roman" w:hAnsi="Times New Roman" w:cs="Times New Roman"/>
-          <w:sz w:val="28"/>
-          <w:szCs w:val="28"/>
-        </w:rPr>
-        <w:t xml:space="preserve"> дизайнеру в первую очередь необходимо </w:t>
-      </w:r>
-      <w:r>
-        <w:rPr>
-          <w:rStyle w:val="translatable-message"/>
-          <w:rFonts w:ascii="Times New Roman" w:hAnsi="Times New Roman" w:cs="Times New Roman"/>
-          <w:sz w:val="28"/>
-          <w:szCs w:val="28"/>
-        </w:rPr>
-        <w:t xml:space="preserve">сосредоточиться на </w:t>
-      </w:r>
-    </w:p>
-    <w:p>
-      <w:pPr>
-        <w:spacing w:line="240" w:lineRule="auto"/>
-        <w:rPr>
-          <w:rStyle w:val="translatable-message"/>
-          <w:rFonts w:ascii="Times New Roman" w:hAnsi="Times New Roman" w:cs="Times New Roman"/>
-          <w:b/>
-          <w:sz w:val="28"/>
-          <w:szCs w:val="28"/>
-        </w:rPr>
-      </w:pPr>
-      <w:r>
-        <w:rPr>
-          <w:rStyle w:val="translatable-message"/>
-          <w:rFonts w:ascii="Times New Roman" w:hAnsi="Times New Roman" w:cs="Times New Roman"/>
-          <w:b/>
-          <w:sz w:val="28"/>
-          <w:szCs w:val="28"/>
-        </w:rPr>
-        <w:t>5. Комментарии команды</w:t>
-      </w:r>
-    </w:p>
-    <w:p>
-      <w:pPr>
-        <w:spacing w:line="240" w:lineRule="auto"/>
-        <w:rPr>
-          <w:rStyle w:val="translatable-message"/>
-          <w:rFonts w:ascii="Times New Roman" w:hAnsi="Times New Roman" w:cs="Times New Roman"/>
-          <w:sz w:val="28"/>
-          <w:szCs w:val="28"/>
-        </w:rPr>
-      </w:pPr>
-      <w:r>
-        <w:rPr>
-          <w:rStyle w:val="translatable-message"/>
-          <w:rFonts w:ascii="Times New Roman" w:hAnsi="Times New Roman" w:cs="Times New Roman"/>
-          <w:sz w:val="28"/>
-          <w:szCs w:val="28"/>
-        </w:rPr>
-        <w:t xml:space="preserve">— </w:t>
-      </w:r>
-      <w:r>
-        <w:rPr>
-          <w:rStyle w:val="translatable-message"/>
-          <w:rFonts w:ascii="Times New Roman" w:hAnsi="Times New Roman" w:cs="Times New Roman"/>
-          <w:sz w:val="28"/>
-          <w:szCs w:val="28"/>
-        </w:rPr>
-        <w:t>комментарии отсутствуют;</w:t>
-      </w:r>
-    </w:p>
-    <w:p>
-      <w:pPr>
-        <w:spacing w:line="240" w:lineRule="auto"/>
-        <w:rPr>
-          <w:rStyle w:val="translatable-message"/>
-          <w:rFonts w:ascii="Times New Roman" w:hAnsi="Times New Roman" w:cs="Times New Roman"/>
-          <w:b/>
-          <w:sz w:val="28"/>
-          <w:szCs w:val="28"/>
-        </w:rPr>
-      </w:pPr>
-      <w:r>
-        <w:rPr>
-          <w:rStyle w:val="translatable-message"/>
-          <w:rFonts w:ascii="Times New Roman" w:hAnsi="Times New Roman" w:cs="Times New Roman"/>
-          <w:b/>
-          <w:sz w:val="28"/>
-          <w:szCs w:val="28"/>
-        </w:rPr>
-        <w:t>6. Заключение PM</w:t>
-      </w:r>
-    </w:p>
-    <w:p>
-      <w:pPr>
-        <w:spacing w:line="240" w:lineRule="auto"/>
-        <w:rPr>
-          <w:rStyle w:val="translatable-message"/>
-          <w:rFonts w:ascii="Times New Roman" w:hAnsi="Times New Roman" w:cs="Times New Roman"/>
-          <w:sz w:val="28"/>
-          <w:szCs w:val="28"/>
-        </w:rPr>
-      </w:pPr>
-      <w:r>
-        <w:rPr>
-          <w:rStyle w:val="translatable-message"/>
-          <w:rFonts w:ascii="Times New Roman" w:hAnsi="Times New Roman" w:cs="Times New Roman"/>
-          <w:sz w:val="28"/>
-          <w:szCs w:val="28"/>
-        </w:rPr>
-        <w:t>Проект движется по плану, но требуе</w:t>
-      </w:r>
-      <w:r>
-        <w:rPr>
-          <w:rStyle w:val="translatable-message"/>
-          <w:rFonts w:ascii="Times New Roman" w:hAnsi="Times New Roman" w:cs="Times New Roman"/>
-          <w:sz w:val="28"/>
-          <w:szCs w:val="28"/>
-        </w:rPr>
-        <w:t>т ускорения работы над</w:t>
-      </w:r>
-      <w:r>
-        <w:rPr>
-          <w:rStyle w:val="translatable-message"/>
-          <w:rFonts w:ascii="Times New Roman" w:hAnsi="Times New Roman" w:cs="Times New Roman"/>
-          <w:sz w:val="28"/>
-          <w:szCs w:val="28"/>
-        </w:rPr>
-        <w:br/>
-        <w:t>фронтенд-</w:t>
-      </w:r>
-      <w:r>
-        <w:rPr>
-          <w:rStyle w:val="translatable-message"/>
-          <w:rFonts w:ascii="Times New Roman" w:hAnsi="Times New Roman" w:cs="Times New Roman"/>
-          <w:sz w:val="28"/>
-          <w:szCs w:val="28"/>
-        </w:rPr>
-        <w:t>частью.</w:t>
-      </w:r>
-    </w:p>
-    <w:p>
-      <w:pPr>
-        <w:spacing w:line="240" w:lineRule="auto"/>
-        <w:rPr>
-          <w:rStyle w:val="translatable-message"/>
-          <w:rFonts w:ascii="Times New Roman" w:hAnsi="Times New Roman" w:cs="Times New Roman"/>
-          <w:sz w:val="28"/>
-          <w:szCs w:val="28"/>
-        </w:rPr>
-      </w:pPr>
-      <w:r>
-        <w:rPr>
-          <w:rStyle w:val="translatable-message"/>
-          <w:rFonts w:ascii="Times New Roman" w:hAnsi="Times New Roman" w:cs="Times New Roman"/>
-          <w:sz w:val="28"/>
-          <w:szCs w:val="28"/>
-        </w:rPr>
-        <w:t xml:space="preserve">PM проекта: </w:t>
-      </w:r>
-      <w:r>
-        <w:rPr>
-          <w:rStyle w:val="translatable-message"/>
-          <w:rFonts w:ascii="Times New Roman" w:hAnsi="Times New Roman" w:cs="Times New Roman"/>
-          <w:sz w:val="28"/>
-          <w:szCs w:val="28"/>
-        </w:rPr>
-        <w:t>Липовцев Алексей Викторович.</w:t>
-      </w:r>
-      <w:r>
-        <w:rPr>
-          <w:rStyle w:val="translatable-message"/>
-          <w:rFonts w:ascii="Times New Roman" w:hAnsi="Times New Roman" w:cs="Times New Roman"/>
-          <w:sz w:val="28"/>
-          <w:szCs w:val="28"/>
-        </w:rPr>
-        <w:t xml:space="preserve"> </w:t>
-      </w:r>
-    </w:p>
-    <w:p>
-      <w:pPr>
-        <w:spacing w:line="240" w:lineRule="auto"/>
-        <w:rPr>
-          <w:rFonts w:ascii="Times New Roman" w:hAnsi="Times New Roman" w:cs="Times New Roman"/>
-          <w:sz w:val="28"/>
-          <w:szCs w:val="28"/>
-        </w:rPr>
-      </w:pPr>
-      <w:r>
-        <w:rPr>
-          <w:rStyle w:val="translatable-message"/>
-          <w:rFonts w:ascii="Times New Roman" w:hAnsi="Times New Roman" w:cs="Times New Roman"/>
-          <w:sz w:val="28"/>
-          <w:szCs w:val="28"/>
-        </w:rPr>
-        <w:t>Дата следующего отчёта: 23.04.2025.</w:t>
+        <w:t>6</w:t>
+      </w:r>
+      <w:r>
+        <w:rPr>
+          <w:rStyle w:val="translatable-message"/>
+          <w:rFonts w:ascii="Times New Roman" w:hAnsi="Times New Roman" w:cs="Times New Roman"/>
+          <w:sz w:val="28"/>
+          <w:szCs w:val="28"/>
+        </w:rPr>
+        <w:t>.04.2025.</w:t>
       </w:r>
     </w:p>
     <w:sectPr>

</xml_diff>